<commit_message>
Jubecer: guards list filters/pagination, dashboard KPIs, requirements upload/download, schema updates
</commit_message>
<xml_diff>
--- a/TEMPLATE.docx
+++ b/TEMPLATE.docx
@@ -330,7 +330,7 @@
                                 <w:sz w:val="24"/>
                                 <w:szCs w:val="24"/>
                               </w:rPr>
-                              <w:t xml:space="preserve">                  </w:t>
+                              <w:t xml:space="preserve">            </w:t>
                             </w:r>
                             <w:r>
                               <w:rPr>
@@ -411,29 +411,7 @@
                           <w:sz w:val="24"/>
                           <w:szCs w:val="24"/>
                         </w:rPr>
-                        <w:t>{{</w:t>
-                      </w:r>
-                      <w:proofErr w:type="spellStart"/>
-                      <w:r>
-                        <w:rPr>
-                          <w:rFonts w:ascii="Arial" w:hAnsi="Arial" w:cs="Arial"/>
-                          <w:b/>
-                          <w:color w:val="1F4E79"/>
-                          <w:sz w:val="24"/>
-                          <w:szCs w:val="24"/>
-                        </w:rPr>
-                        <w:t>np_clearance</w:t>
-                      </w:r>
-                      <w:proofErr w:type="spellEnd"/>
-                      <w:r>
-                        <w:rPr>
-                          <w:rFonts w:ascii="Arial" w:hAnsi="Arial" w:cs="Arial"/>
-                          <w:b/>
-                          <w:color w:val="1F4E79"/>
-                          <w:sz w:val="24"/>
-                          <w:szCs w:val="24"/>
-                        </w:rPr>
-                        <w:t xml:space="preserve">}}    </w:t>
+                        <w:t xml:space="preserve">{{np_clearance}}    </w:t>
                       </w:r>
                       <w:r>
                         <w:rPr>
@@ -483,7 +461,7 @@
                           <w:sz w:val="24"/>
                           <w:szCs w:val="24"/>
                         </w:rPr>
-                        <w:t xml:space="preserve">                  </w:t>
+                        <w:t xml:space="preserve">            </w:t>
                       </w:r>
                       <w:r>
                         <w:rPr>
@@ -493,29 +471,7 @@
                           <w:sz w:val="24"/>
                           <w:szCs w:val="24"/>
                         </w:rPr>
-                        <w:t>{{</w:t>
-                      </w:r>
-                      <w:proofErr w:type="spellStart"/>
-                      <w:r>
-                        <w:rPr>
-                          <w:rFonts w:ascii="Arial" w:hAnsi="Arial" w:cs="Arial"/>
-                          <w:b/>
-                          <w:color w:val="1F4E79"/>
-                          <w:sz w:val="24"/>
-                          <w:szCs w:val="24"/>
-                        </w:rPr>
-                        <w:t>document_date</w:t>
-                      </w:r>
-                      <w:proofErr w:type="spellEnd"/>
-                      <w:r>
-                        <w:rPr>
-                          <w:rFonts w:ascii="Arial" w:hAnsi="Arial" w:cs="Arial"/>
-                          <w:b/>
-                          <w:color w:val="1F4E79"/>
-                          <w:sz w:val="24"/>
-                          <w:szCs w:val="24"/>
-                        </w:rPr>
-                        <w:t>}}</w:t>
+                        <w:t>{{document_date}}</w:t>
                       </w:r>
                     </w:p>
                     <w:p>

</xml_diff>